<commit_message>
Merkblätter auch in PDF
</commit_message>
<xml_diff>
--- a/Merkblätter/Merkblatt_Prüflinge_KB-EAA.docx
+++ b/Merkblätter/Merkblatt_Prüflinge_KB-EAA.docx
@@ -26,16 +26,9 @@
       <w:r>
         <w:t xml:space="preserve">Version </w:t>
       </w:r>
-      <w:del w:id="0" w:author="Gottfried Zimmermann" w:date="2026-03-20T10:55:00Z" w16du:dateUtc="2026-03-20T09:55:00Z">
-        <w:r>
-          <w:delText>2</w:delText>
-        </w:r>
-      </w:del>
-      <w:ins w:id="1" w:author="Gottfried Zimmermann" w:date="2026-03-20T10:55:00Z" w16du:dateUtc="2026-03-20T09:55:00Z">
-        <w:r>
-          <w:t>3</w:t>
-        </w:r>
-      </w:ins>
+      <w:r>
+        <w:t>3</w:t>
+      </w:r>
       <w:r>
         <w:t xml:space="preserve"> – 202</w:t>
       </w:r>
@@ -48,16 +41,9 @@
       <w:r>
         <w:t>03-</w:t>
       </w:r>
-      <w:ins w:id="2" w:author="Gottfried Zimmermann" w:date="2026-03-20T10:55:00Z" w16du:dateUtc="2026-03-20T09:55:00Z">
-        <w:r>
-          <w:t>20</w:t>
-        </w:r>
-      </w:ins>
-      <w:del w:id="3" w:author="Gottfried Zimmermann" w:date="2026-03-20T10:55:00Z" w16du:dateUtc="2026-03-20T09:55:00Z">
-        <w:r>
-          <w:delText>11</w:delText>
-        </w:r>
-      </w:del>
+      <w:r>
+        <w:t>20</w:t>
+      </w:r>
     </w:p>
     <w:p>
       <w:r>
@@ -249,15 +235,10 @@
           <w:ilvl w:val="0"/>
           <w:numId w:val="8"/>
         </w:numPr>
-        <w:rPr>
-          <w:ins w:id="4" w:author="Gottfried Zimmermann" w:date="2026-03-20T10:56:00Z" w16du:dateUtc="2026-03-20T09:56:00Z"/>
-        </w:rPr>
-      </w:pPr>
-      <w:ins w:id="5" w:author="Gottfried Zimmermann" w:date="2026-03-20T10:56:00Z" w16du:dateUtc="2026-03-20T09:56:00Z">
-        <w:r>
-          <w:t>Bringen Sie zur Prüfung mit:</w:t>
-        </w:r>
-      </w:ins>
+      </w:pPr>
+      <w:r>
+        <w:t>Bringen Sie zur Prüfung mit:</w:t>
+      </w:r>
     </w:p>
     <w:p>
       <w:pPr>
@@ -266,23 +247,10 @@
           <w:ilvl w:val="1"/>
           <w:numId w:val="8"/>
         </w:numPr>
-        <w:rPr>
-          <w:ins w:id="6" w:author="Gottfried Zimmermann" w:date="2026-03-20T10:56:00Z" w16du:dateUtc="2026-03-20T09:56:00Z"/>
-        </w:rPr>
-      </w:pPr>
-      <w:ins w:id="7" w:author="Gottfried Zimmermann" w:date="2026-03-20T10:56:00Z" w16du:dateUtc="2026-03-20T09:56:00Z">
-        <w:r>
-          <w:t xml:space="preserve">Nach Möglichkeit Ihren eigenen </w:t>
-        </w:r>
-        <w:proofErr w:type="gramStart"/>
-        <w:r>
-          <w:t xml:space="preserve">Laptop </w:t>
-        </w:r>
-        <w:r>
-          <w:t>.</w:t>
-        </w:r>
-        <w:proofErr w:type="gramEnd"/>
-      </w:ins>
+      </w:pPr>
+      <w:r>
+        <w:t>Nach Möglichkeit Ihren eigenen Laptop.</w:t>
+      </w:r>
     </w:p>
     <w:p>
       <w:pPr>
@@ -291,28 +259,10 @@
           <w:ilvl w:val="1"/>
           <w:numId w:val="8"/>
         </w:numPr>
-        <w:rPr>
-          <w:ins w:id="8" w:author="Gottfried Zimmermann" w:date="2026-03-20T10:56:00Z" w16du:dateUtc="2026-03-20T09:56:00Z"/>
-        </w:rPr>
-        <w:pPrChange w:id="9" w:author="Unknown" w:date="2026-03-20T10:42:00Z">
-          <w:pPr>
-            <w:pStyle w:val="Listenabsatz"/>
-            <w:numPr>
-              <w:ilvl w:val="1"/>
-              <w:numId w:val="2"/>
-            </w:numPr>
-            <w:ind w:hanging="360"/>
-          </w:pPr>
-        </w:pPrChange>
-      </w:pPr>
-      <w:ins w:id="10" w:author="Gottfried Zimmermann" w:date="2026-03-20T10:56:00Z" w16du:dateUtc="2026-03-20T09:56:00Z">
-        <w:r>
-          <w:t>Einen Kopfhörer, falls Sie einen Screenreader oder eine Vorlesefunktion während der Prüfung nutzen wollen</w:t>
-        </w:r>
-        <w:r>
-          <w:t>.</w:t>
-        </w:r>
-      </w:ins>
+      </w:pPr>
+      <w:r>
+        <w:t>Einen Kopfhörer, falls Sie einen Screenreader oder eine Vorlesefunktion während der Prüfung nutzen wollen.</w:t>
+      </w:r>
     </w:p>
     <w:p>
       <w:pPr>
@@ -321,44 +271,10 @@
           <w:ilvl w:val="1"/>
           <w:numId w:val="8"/>
         </w:numPr>
-        <w:rPr>
-          <w:ins w:id="11" w:author="Gottfried Zimmermann" w:date="2026-03-20T10:56:00Z" w16du:dateUtc="2026-03-20T09:56:00Z"/>
-        </w:rPr>
-      </w:pPr>
-      <w:ins w:id="12" w:author="Gottfried Zimmermann" w:date="2026-03-20T10:56:00Z" w16du:dateUtc="2026-03-20T09:56:00Z">
-        <w:r>
-          <w:t>Ein leeres Blatt Papier (DIN A4) für Ihre Notizen</w:t>
-        </w:r>
-        <w:r>
-          <w:t>.</w:t>
-        </w:r>
-      </w:ins>
-    </w:p>
-    <w:p>
-      <w:pPr>
-        <w:pStyle w:val="Listenabsatz"/>
-        <w:numPr>
-          <w:ilvl w:val="1"/>
-          <w:numId w:val="8"/>
-        </w:numPr>
-        <w:rPr>
-          <w:del w:id="13" w:author="Gottfried Zimmermann" w:date="2026-03-20T10:56:00Z" w16du:dateUtc="2026-03-20T09:56:00Z"/>
-        </w:rPr>
-        <w:pPrChange w:id="14" w:author="Gottfried Zimmermann" w:date="2026-03-20T10:56:00Z" w16du:dateUtc="2026-03-20T09:56:00Z">
-          <w:pPr>
-            <w:pStyle w:val="Listenabsatz"/>
-            <w:numPr>
-              <w:numId w:val="8"/>
-            </w:numPr>
-            <w:ind w:hanging="360"/>
-          </w:pPr>
-        </w:pPrChange>
-      </w:pPr>
-      <w:del w:id="15" w:author="Gottfried Zimmermann" w:date="2026-03-20T10:56:00Z" w16du:dateUtc="2026-03-20T09:56:00Z">
-        <w:r>
-          <w:delText>Bringen Sie nach Möglichkeit Ihren eigenen Laptop mit zur Prüfung.</w:delText>
-        </w:r>
-      </w:del>
+      </w:pPr>
+      <w:r>
+        <w:t>Ein leeres Blatt Papier (DIN A4) für Ihre Notizen.</w:t>
+      </w:r>
     </w:p>
     <w:p>
       <w:pPr>
@@ -523,15 +439,10 @@
           <w:ilvl w:val="0"/>
           <w:numId w:val="9"/>
         </w:numPr>
-        <w:rPr>
-          <w:ins w:id="16" w:author="Gottfried Zimmermann" w:date="2026-03-20T10:56:00Z" w16du:dateUtc="2026-03-20T09:56:00Z"/>
-        </w:rPr>
-      </w:pPr>
-      <w:ins w:id="17" w:author="Gottfried Zimmermann" w:date="2026-03-20T10:56:00Z" w16du:dateUtc="2026-03-20T09:56:00Z">
-        <w:r>
-          <w:t>Wenn Sie einen Screenreader oder eine Vorlesefunktion verwenden, verwenden Sie bitte einen Kopfhörer.</w:t>
-        </w:r>
-      </w:ins>
+      </w:pPr>
+      <w:r>
+        <w:t>Wenn Sie einen Screenreader oder eine Vorlesefunktion verwenden, verwenden Sie bitte einen Kopfhörer.</w:t>
+      </w:r>
     </w:p>
     <w:p>
       <w:pPr>
@@ -540,15 +451,10 @@
           <w:ilvl w:val="0"/>
           <w:numId w:val="9"/>
         </w:numPr>
-        <w:rPr>
-          <w:ins w:id="18" w:author="Gottfried Zimmermann" w:date="2026-03-20T10:56:00Z" w16du:dateUtc="2026-03-20T09:56:00Z"/>
-        </w:rPr>
-      </w:pPr>
-      <w:ins w:id="19" w:author="Gottfried Zimmermann" w:date="2026-03-20T10:56:00Z" w16du:dateUtc="2026-03-20T09:56:00Z">
-        <w:r>
-          <w:t>Sie dürfen ein leeres Blatt Papier (DIN A4) für Ihre Notizen verwenden. Dieses müssen Sie nach der Prüfung bei der Aufsicht abgeben.</w:t>
-        </w:r>
-      </w:ins>
+      </w:pPr>
+      <w:r>
+        <w:t>Sie dürfen ein leeres Blatt Papier (DIN A4) für Ihre Notizen verwenden. Dieses müssen Sie nach der Prüfung bei der Aufsicht abgeben.</w:t>
+      </w:r>
     </w:p>
     <w:p>
       <w:pPr>
@@ -557,15 +463,10 @@
           <w:ilvl w:val="0"/>
           <w:numId w:val="9"/>
         </w:numPr>
-        <w:rPr>
-          <w:ins w:id="20" w:author="Gottfried Zimmermann" w:date="2026-03-20T10:56:00Z" w16du:dateUtc="2026-03-20T09:56:00Z"/>
-        </w:rPr>
-      </w:pPr>
-      <w:ins w:id="21" w:author="Gottfried Zimmermann" w:date="2026-03-20T10:56:00Z" w16du:dateUtc="2026-03-20T09:56:00Z">
-        <w:r>
-          <w:t>Sie dürfen auf die Toilette gehen, aber Sie müssen Ihr Handy im Examensraum lassen. Es darf nur immer eine Person auf einmal auf die Toilette gehen. Die Bearbeitungszeit für die Prüfung wird dadurch nicht verlängert.</w:t>
-        </w:r>
-      </w:ins>
+      </w:pPr>
+      <w:r>
+        <w:t>Sie dürfen auf die Toilette gehen, aber Sie müssen Ihr Handy im Examensraum lassen. Es darf nur immer eine Person auf einmal auf die Toilette gehen. Die Bearbeitungszeit für die Prüfung wird dadurch nicht verlängert.</w:t>
+      </w:r>
     </w:p>
     <w:p>
       <w:pPr>
@@ -574,32 +475,10 @@
           <w:ilvl w:val="0"/>
           <w:numId w:val="9"/>
         </w:numPr>
-        <w:rPr>
-          <w:ins w:id="22" w:author="Gottfried Zimmermann" w:date="2026-03-20T10:56:00Z" w16du:dateUtc="2026-03-20T09:56:00Z"/>
-        </w:rPr>
-      </w:pPr>
-      <w:ins w:id="23" w:author="Gottfried Zimmermann" w:date="2026-03-20T10:56:00Z" w16du:dateUtc="2026-03-20T09:56:00Z">
-        <w:r>
-          <w:t xml:space="preserve">Ihre Antworten werden auf einem Moodle- Server gespeichert. Wir sind bemüht, für einen reibungslosen technischen Ablauf zu sorgen. Falls Sie trotzdem auf ein technisches Problem stoßen sollten, oder falls Sie den Browser während der Prüfung aus Versehen schließen, öffnen Sie ein neues Browserfenster und setzen Ihr Examen im Kurs mit dem gegebenen Link weiter fort. </w:t>
-        </w:r>
-      </w:ins>
-    </w:p>
-    <w:p>
-      <w:pPr>
-        <w:pStyle w:val="Listenabsatz"/>
-        <w:numPr>
-          <w:ilvl w:val="0"/>
-          <w:numId w:val="9"/>
-        </w:numPr>
-        <w:rPr>
-          <w:del w:id="24" w:author="Gottfried Zimmermann" w:date="2026-03-20T10:56:00Z" w16du:dateUtc="2026-03-20T09:56:00Z"/>
-        </w:rPr>
-      </w:pPr>
-      <w:del w:id="25" w:author="Gottfried Zimmermann" w:date="2026-03-20T10:56:00Z" w16du:dateUtc="2026-03-20T09:56:00Z">
-        <w:r>
-          <w:delText>Falls Sie den Browser während der Prüfung aus Versehen schließen, öffnen Sie den Browser wieder und setzen Ihr Examen im Kurs weiter fort.</w:delText>
-        </w:r>
-      </w:del>
+      </w:pPr>
+      <w:r>
+        <w:t xml:space="preserve">Ihre Antworten werden auf einem Moodle- Server gespeichert. Wir sind bemüht, für einen reibungslosen technischen Ablauf zu sorgen. Falls Sie trotzdem auf ein technisches Problem stoßen sollten, oder falls Sie den Browser während der Prüfung aus Versehen schließen, öffnen Sie ein neues Browserfenster und setzen Ihr Examen im Kurs mit dem gegebenen Link weiter fort. </w:t>
+      </w:r>
     </w:p>
     <w:p>
       <w:pPr>
@@ -612,7 +491,6 @@
         <w:rPr>
           <w:rStyle w:val="Heading2Char"/>
         </w:rPr>
-        <w:lastRenderedPageBreak/>
         <w:t>Nach der Prüfung</w:t>
       </w:r>
     </w:p>
@@ -637,6 +515,7 @@
         </w:numPr>
       </w:pPr>
       <w:r>
+        <w:lastRenderedPageBreak/>
         <w:t xml:space="preserve">Sie bekommen Ihr Ergebnis </w:t>
       </w:r>
       <w:r>
@@ -656,15 +535,10 @@
           <w:ilvl w:val="0"/>
           <w:numId w:val="10"/>
         </w:numPr>
-        <w:rPr>
-          <w:ins w:id="26" w:author="Gottfried Zimmermann" w:date="2026-03-20T10:57:00Z" w16du:dateUtc="2026-03-20T09:57:00Z"/>
-        </w:rPr>
-      </w:pPr>
-      <w:ins w:id="27" w:author="Gottfried Zimmermann" w:date="2026-03-20T10:57:00Z" w16du:dateUtc="2026-03-20T09:57:00Z">
-        <w:r>
-          <w:t>Falls Sie Notizen auf Papier in der Prüfung erstellt haben, geben Sie es bei der Aufsichtsperson ab.</w:t>
-        </w:r>
-      </w:ins>
+      </w:pPr>
+      <w:r>
+        <w:t>Falls Sie Notizen auf Papier in der Prüfung erstellt haben, geben Sie es bei der Aufsichtsperson ab.</w:t>
+      </w:r>
     </w:p>
     <w:p>
       <w:pPr>
@@ -677,16 +551,12 @@
       <w:r>
         <w:t>Bitte beachten Sie, dass die Prüfungsfragen nach Abschluss der Prüfung der Vertraulichkeit unterliegen. Eine Weitergabe, Vervielfältigung oder Veröffentlichung ist nicht gestattet.</w:t>
       </w:r>
-      <w:ins w:id="28" w:author="Gottfried Zimmermann" w:date="2026-03-20T10:57:00Z" w16du:dateUtc="2026-03-20T09:57:00Z">
-        <w:r>
-          <w:t xml:space="preserve"> </w:t>
-        </w:r>
-      </w:ins>
-      <w:ins w:id="29" w:author="Gottfried Zimmermann" w:date="2026-03-20T10:57:00Z">
-        <w:r>
-          <w:t>Bei Zuwiderhandlungen wird Ihr Knowledge Badge aberkannt. Außerdem behalten wir uns weitere geeignete Maßnahmen vor.</w:t>
-        </w:r>
-      </w:ins>
+      <w:r>
+        <w:t xml:space="preserve"> </w:t>
+      </w:r>
+      <w:r>
+        <w:t>Bei Zuwiderhandlungen wird Ihr Knowledge Badge aberkannt. Außerdem behalten wir uns weitere geeignete Maßnahmen vor.</w:t>
+      </w:r>
     </w:p>
     <w:p>
       <w:pPr>
@@ -3053,49 +2923,14 @@
   </w:num>
   <w:num w:numId="23" w16cid:durableId="98531694">
     <w:abstractNumId w:val="4"/>
-    <w:lvlOverride w:ilvl="0"/>
-    <w:lvlOverride w:ilvl="1"/>
-    <w:lvlOverride w:ilvl="2"/>
-    <w:lvlOverride w:ilvl="3"/>
-    <w:lvlOverride w:ilvl="4"/>
-    <w:lvlOverride w:ilvl="5"/>
-    <w:lvlOverride w:ilvl="6"/>
-    <w:lvlOverride w:ilvl="7"/>
-    <w:lvlOverride w:ilvl="8"/>
   </w:num>
   <w:num w:numId="24" w16cid:durableId="77292491">
     <w:abstractNumId w:val="5"/>
-    <w:lvlOverride w:ilvl="0"/>
-    <w:lvlOverride w:ilvl="1"/>
-    <w:lvlOverride w:ilvl="2"/>
-    <w:lvlOverride w:ilvl="3"/>
-    <w:lvlOverride w:ilvl="4"/>
-    <w:lvlOverride w:ilvl="5"/>
-    <w:lvlOverride w:ilvl="6"/>
-    <w:lvlOverride w:ilvl="7"/>
-    <w:lvlOverride w:ilvl="8"/>
   </w:num>
   <w:num w:numId="25" w16cid:durableId="210457920">
     <w:abstractNumId w:val="8"/>
-    <w:lvlOverride w:ilvl="0"/>
-    <w:lvlOverride w:ilvl="1"/>
-    <w:lvlOverride w:ilvl="2"/>
-    <w:lvlOverride w:ilvl="3"/>
-    <w:lvlOverride w:ilvl="4"/>
-    <w:lvlOverride w:ilvl="5"/>
-    <w:lvlOverride w:ilvl="6"/>
-    <w:lvlOverride w:ilvl="7"/>
-    <w:lvlOverride w:ilvl="8"/>
   </w:num>
 </w:numbering>
-</file>
-
-<file path=word/people.xml><?xml version="1.0" encoding="utf-8"?>
-<w15:people xmlns:wpc="http://schemas.microsoft.com/office/word/2010/wordprocessingCanvas" xmlns:cx="http://schemas.microsoft.com/office/drawing/2014/chartex" xmlns:cx1="http://schemas.microsoft.com/office/drawing/2015/9/8/chartex" xmlns:cx2="http://schemas.microsoft.com/office/drawing/2015/10/21/chartex" xmlns:cx3="http://schemas.microsoft.com/office/drawing/2016/5/9/chartex" xmlns:cx4="http://schemas.microsoft.com/office/drawing/2016/5/10/chartex" xmlns:cx5="http://schemas.microsoft.com/office/drawing/2016/5/11/chartex" xmlns:cx6="http://schemas.microsoft.com/office/drawing/2016/5/12/chartex" xmlns:cx7="http://schemas.microsoft.com/office/drawing/2016/5/13/chartex" xmlns:cx8="http://schemas.microsoft.com/office/drawing/2016/5/14/chartex" xmlns:mc="http://schemas.openxmlformats.org/markup-compatibility/2006" xmlns:aink="http://schemas.microsoft.com/office/drawing/2016/ink" xmlns:am3d="http://schemas.microsoft.com/office/drawing/2017/model3d" xmlns:o="urn:schemas-microsoft-com:office:office" xmlns:oel="http://schemas.microsoft.com/office/2019/extlst" xmlns:r="http://schemas.openxmlformats.org/officeDocument/2006/relationships" xmlns:m="http://schemas.openxmlformats.org/officeDocument/2006/math" xmlns:v="urn:schemas-microsoft-com:vml" xmlns:wp14="http://schemas.microsoft.com/office/word/2010/wordprocessingDrawing" xmlns:wp="http://schemas.openxmlformats.org/drawingml/2006/wordprocessingDrawing" xmlns:w10="urn:schemas-microsoft-com:office:word" xmlns:w="http://schemas.openxmlformats.org/wordprocessingml/2006/main" xmlns:w14="http://schemas.microsoft.com/office/word/2010/wordml" xmlns:w15="http://schemas.microsoft.com/office/word/2012/wordml" xmlns:w16cex="http://schemas.microsoft.com/office/word/2018/wordml/cex" xmlns:w16cid="http://schemas.microsoft.com/office/word/2016/wordml/cid" xmlns:w16="http://schemas.microsoft.com/office/word/2018/wordml" xmlns:w16du="http://schemas.microsoft.com/office/word/2023/wordml/word16du" xmlns:w16sdtdh="http://schemas.microsoft.com/office/word/2020/wordml/sdtdatahash" xmlns:w16sdtfl="http://schemas.microsoft.com/office/word/2024/wordml/sdtformatlock" xmlns:w16se="http://schemas.microsoft.com/office/word/2015/wordml/symex" xmlns:wpg="http://schemas.microsoft.com/office/word/2010/wordprocessingGroup" xmlns:wpi="http://schemas.microsoft.com/office/word/2010/wordprocessingInk" xmlns:wne="http://schemas.microsoft.com/office/word/2006/wordml" xmlns:wps="http://schemas.microsoft.com/office/word/2010/wordprocessingShape" mc:Ignorable="w14 w15 w16se w16cid w16 w16cex w16sdtdh w16sdtfl w16du wp14">
-  <w15:person w15:author="Gottfried Zimmermann">
-    <w15:presenceInfo w15:providerId="Windows Live" w15:userId="89dddc6042953ddf"/>
-  </w15:person>
-</w15:people>
 </file>
 
 <file path=word/styles.xml><?xml version="1.0" encoding="utf-8"?>
@@ -3697,6 +3532,7 @@
   <w:style w:type="character" w:default="1" w:styleId="Absatz-Standardschriftart">
     <w:name w:val="Default Paragraph Font"/>
     <w:uiPriority w:val="1"/>
+    <w:semiHidden/>
     <w:unhideWhenUsed/>
   </w:style>
   <w:style w:type="table" w:default="1" w:styleId="NormaleTabelle">

</xml_diff>